<commit_message>
vault backup: 2026-02-25 16:10:46
</commit_message>
<xml_diff>
--- a/Materias/Diseño de sistemas/Material/TP1/Flujos de sucesos/CU1 - Solicitar servicio/CU - Solicitar servicio.docx
+++ b/Materias/Diseño de sistemas/Material/TP1/Flujos de sucesos/CU1 - Solicitar servicio/CU - Solicitar servicio.docx
@@ -2259,26 +2259,12 @@
                 <w:insideV w:val="single" w:sz="18" w:space="0" w:color="FF0000"/>
               </w:tblBorders>
               <w:tblLayout w:type="fixed"/>
-              <w:tblCellMar>
-                <w:top w:w="0" w:type="dxa"/>
-                <w:left w:w="0" w:type="dxa"/>
-                <w:bottom w:w="0" w:type="dxa"/>
-                <w:right w:w="0" w:type="dxa"/>
-              </w:tblCellMar>
               <w:tblLook w:val="0600" w:firstRow="0" w:lastRow="0" w:firstColumn="0" w:lastColumn="0" w:noHBand="1" w:noVBand="1"/>
             </w:tblPr>
             <w:tblGrid>
               <w:gridCol w:w="5665"/>
             </w:tblGrid>
             <w:tr>
-              <w:tblPrEx>
-                <w:tblCellMar>
-                  <w:top w:w="0" w:type="dxa"/>
-                  <w:left w:w="0" w:type="dxa"/>
-                  <w:bottom w:w="0" w:type="dxa"/>
-                  <w:right w:w="0" w:type="dxa"/>
-                </w:tblCellMar>
-              </w:tblPrEx>
               <w:tc>
                 <w:tcPr>
                   <w:tcW w:w="5665" w:type="dxa"/>
@@ -2774,26 +2760,12 @@
                 <w:insideV w:val="single" w:sz="18" w:space="0" w:color="FF0000"/>
               </w:tblBorders>
               <w:tblLayout w:type="fixed"/>
-              <w:tblCellMar>
-                <w:top w:w="0" w:type="dxa"/>
-                <w:left w:w="0" w:type="dxa"/>
-                <w:bottom w:w="0" w:type="dxa"/>
-                <w:right w:w="0" w:type="dxa"/>
-              </w:tblCellMar>
               <w:tblLook w:val="0600" w:firstRow="0" w:lastRow="0" w:firstColumn="0" w:lastColumn="0" w:noHBand="1" w:noVBand="1"/>
             </w:tblPr>
             <w:tblGrid>
               <w:gridCol w:w="5665"/>
             </w:tblGrid>
             <w:tr>
-              <w:tblPrEx>
-                <w:tblCellMar>
-                  <w:top w:w="0" w:type="dxa"/>
-                  <w:left w:w="0" w:type="dxa"/>
-                  <w:bottom w:w="0" w:type="dxa"/>
-                  <w:right w:w="0" w:type="dxa"/>
-                </w:tblCellMar>
-              </w:tblPrEx>
               <w:tc>
                 <w:tcPr>
                   <w:tcW w:w="5665" w:type="dxa"/>
@@ -3594,26 +3566,12 @@
                 <w:insideV w:val="single" w:sz="18" w:space="0" w:color="FF0000"/>
               </w:tblBorders>
               <w:tblLayout w:type="fixed"/>
-              <w:tblCellMar>
-                <w:top w:w="0" w:type="dxa"/>
-                <w:left w:w="0" w:type="dxa"/>
-                <w:bottom w:w="0" w:type="dxa"/>
-                <w:right w:w="0" w:type="dxa"/>
-              </w:tblCellMar>
               <w:tblLook w:val="0600" w:firstRow="0" w:lastRow="0" w:firstColumn="0" w:lastColumn="0" w:noHBand="1" w:noVBand="1"/>
             </w:tblPr>
             <w:tblGrid>
               <w:gridCol w:w="5665"/>
             </w:tblGrid>
             <w:tr>
-              <w:tblPrEx>
-                <w:tblCellMar>
-                  <w:top w:w="0" w:type="dxa"/>
-                  <w:left w:w="0" w:type="dxa"/>
-                  <w:bottom w:w="0" w:type="dxa"/>
-                  <w:right w:w="0" w:type="dxa"/>
-                </w:tblCellMar>
-              </w:tblPrEx>
               <w:tc>
                 <w:tcPr>
                   <w:tcW w:w="5665" w:type="dxa"/>
@@ -3704,26 +3662,12 @@
                           <w:insideV w:val="single" w:sz="18" w:space="0" w:color="FF780A"/>
                         </w:tblBorders>
                         <w:tblLayout w:type="fixed"/>
-                        <w:tblCellMar>
-                          <w:top w:w="0" w:type="dxa"/>
-                          <w:left w:w="0" w:type="dxa"/>
-                          <w:bottom w:w="0" w:type="dxa"/>
-                          <w:right w:w="0" w:type="dxa"/>
-                        </w:tblCellMar>
                         <w:tblLook w:val="0600" w:firstRow="0" w:lastRow="0" w:firstColumn="0" w:lastColumn="0" w:noHBand="1" w:noVBand="1"/>
                       </w:tblPr>
                       <w:tblGrid>
                         <w:gridCol w:w="5465"/>
                       </w:tblGrid>
                       <w:tr>
-                        <w:tblPrEx>
-                          <w:tblCellMar>
-                            <w:top w:w="0" w:type="dxa"/>
-                            <w:left w:w="0" w:type="dxa"/>
-                            <w:bottom w:w="0" w:type="dxa"/>
-                            <w:right w:w="0" w:type="dxa"/>
-                          </w:tblCellMar>
-                        </w:tblPrEx>
                         <w:tc>
                           <w:tcPr>
                             <w:tcW w:w="5465" w:type="dxa"/>
@@ -4135,26 +4079,12 @@
                 <w:insideV w:val="single" w:sz="18" w:space="0" w:color="FF0000"/>
               </w:tblBorders>
               <w:tblLayout w:type="fixed"/>
-              <w:tblCellMar>
-                <w:top w:w="0" w:type="dxa"/>
-                <w:left w:w="0" w:type="dxa"/>
-                <w:bottom w:w="0" w:type="dxa"/>
-                <w:right w:w="0" w:type="dxa"/>
-              </w:tblCellMar>
               <w:tblLook w:val="0600" w:firstRow="0" w:lastRow="0" w:firstColumn="0" w:lastColumn="0" w:noHBand="1" w:noVBand="1"/>
             </w:tblPr>
             <w:tblGrid>
               <w:gridCol w:w="5665"/>
             </w:tblGrid>
             <w:tr>
-              <w:tblPrEx>
-                <w:tblCellMar>
-                  <w:top w:w="0" w:type="dxa"/>
-                  <w:left w:w="0" w:type="dxa"/>
-                  <w:bottom w:w="0" w:type="dxa"/>
-                  <w:right w:w="0" w:type="dxa"/>
-                </w:tblCellMar>
-              </w:tblPrEx>
               <w:tc>
                 <w:tcPr>
                   <w:tcW w:w="5665" w:type="dxa"/>
@@ -4580,26 +4510,12 @@
                           <w:insideV w:val="single" w:sz="18" w:space="0" w:color="FF780A"/>
                         </w:tblBorders>
                         <w:tblLayout w:type="fixed"/>
-                        <w:tblCellMar>
-                          <w:top w:w="0" w:type="dxa"/>
-                          <w:left w:w="0" w:type="dxa"/>
-                          <w:bottom w:w="0" w:type="dxa"/>
-                          <w:right w:w="0" w:type="dxa"/>
-                        </w:tblCellMar>
                         <w:tblLook w:val="0600" w:firstRow="0" w:lastRow="0" w:firstColumn="0" w:lastColumn="0" w:noHBand="1" w:noVBand="1"/>
                       </w:tblPr>
                       <w:tblGrid>
                         <w:gridCol w:w="5465"/>
                       </w:tblGrid>
                       <w:tr>
-                        <w:tblPrEx>
-                          <w:tblCellMar>
-                            <w:top w:w="0" w:type="dxa"/>
-                            <w:left w:w="0" w:type="dxa"/>
-                            <w:bottom w:w="0" w:type="dxa"/>
-                            <w:right w:w="0" w:type="dxa"/>
-                          </w:tblCellMar>
-                        </w:tblPrEx>
                         <w:tc>
                           <w:tcPr>
                             <w:tcW w:w="5465" w:type="dxa"/>
@@ -4855,26 +4771,12 @@
                           <w:insideV w:val="single" w:sz="18" w:space="0" w:color="FF780A"/>
                         </w:tblBorders>
                         <w:tblLayout w:type="fixed"/>
-                        <w:tblCellMar>
-                          <w:top w:w="0" w:type="dxa"/>
-                          <w:left w:w="0" w:type="dxa"/>
-                          <w:bottom w:w="0" w:type="dxa"/>
-                          <w:right w:w="0" w:type="dxa"/>
-                        </w:tblCellMar>
                         <w:tblLook w:val="0600" w:firstRow="0" w:lastRow="0" w:firstColumn="0" w:lastColumn="0" w:noHBand="1" w:noVBand="1"/>
                       </w:tblPr>
                       <w:tblGrid>
                         <w:gridCol w:w="5465"/>
                       </w:tblGrid>
                       <w:tr>
-                        <w:tblPrEx>
-                          <w:tblCellMar>
-                            <w:top w:w="0" w:type="dxa"/>
-                            <w:left w:w="0" w:type="dxa"/>
-                            <w:bottom w:w="0" w:type="dxa"/>
-                            <w:right w:w="0" w:type="dxa"/>
-                          </w:tblCellMar>
-                        </w:tblPrEx>
                         <w:tc>
                           <w:tcPr>
                             <w:tcW w:w="5465" w:type="dxa"/>
@@ -5134,26 +5036,12 @@
                 <w:insideV w:val="single" w:sz="18" w:space="0" w:color="FF0000"/>
               </w:tblBorders>
               <w:tblLayout w:type="fixed"/>
-              <w:tblCellMar>
-                <w:top w:w="0" w:type="dxa"/>
-                <w:left w:w="0" w:type="dxa"/>
-                <w:bottom w:w="0" w:type="dxa"/>
-                <w:right w:w="0" w:type="dxa"/>
-              </w:tblCellMar>
               <w:tblLook w:val="0600" w:firstRow="0" w:lastRow="0" w:firstColumn="0" w:lastColumn="0" w:noHBand="1" w:noVBand="1"/>
             </w:tblPr>
             <w:tblGrid>
               <w:gridCol w:w="5665"/>
             </w:tblGrid>
             <w:tr>
-              <w:tblPrEx>
-                <w:tblCellMar>
-                  <w:top w:w="0" w:type="dxa"/>
-                  <w:left w:w="0" w:type="dxa"/>
-                  <w:bottom w:w="0" w:type="dxa"/>
-                  <w:right w:w="0" w:type="dxa"/>
-                </w:tblCellMar>
-              </w:tblPrEx>
               <w:tc>
                 <w:tcPr>
                   <w:tcW w:w="5665" w:type="dxa"/>
@@ -14347,9 +14235,7 @@
       <w:tblStyleRowBandSize w:val="1"/>
       <w:tblStyleColBandSize w:val="1"/>
       <w:tblCellMar>
-        <w:top w:w="0" w:type="dxa"/>
         <w:left w:w="108" w:type="dxa"/>
-        <w:bottom w:w="0" w:type="dxa"/>
         <w:right w:w="108" w:type="dxa"/>
       </w:tblCellMar>
     </w:tblPr>
@@ -14363,9 +14249,7 @@
       <w:tblStyleRowBandSize w:val="1"/>
       <w:tblStyleColBandSize w:val="1"/>
       <w:tblCellMar>
-        <w:top w:w="0" w:type="dxa"/>
         <w:left w:w="108" w:type="dxa"/>
-        <w:bottom w:w="0" w:type="dxa"/>
         <w:right w:w="108" w:type="dxa"/>
       </w:tblCellMar>
     </w:tblPr>
@@ -14379,9 +14263,7 @@
       <w:tblStyleRowBandSize w:val="1"/>
       <w:tblStyleColBandSize w:val="1"/>
       <w:tblCellMar>
-        <w:top w:w="0" w:type="dxa"/>
         <w:left w:w="108" w:type="dxa"/>
-        <w:bottom w:w="0" w:type="dxa"/>
         <w:right w:w="108" w:type="dxa"/>
       </w:tblCellMar>
     </w:tblPr>
@@ -14395,9 +14277,7 @@
       <w:tblStyleRowBandSize w:val="1"/>
       <w:tblStyleColBandSize w:val="1"/>
       <w:tblCellMar>
-        <w:top w:w="0" w:type="dxa"/>
         <w:left w:w="108" w:type="dxa"/>
-        <w:bottom w:w="0" w:type="dxa"/>
         <w:right w:w="108" w:type="dxa"/>
       </w:tblCellMar>
     </w:tblPr>
@@ -14411,9 +14291,7 @@
       <w:tblStyleRowBandSize w:val="1"/>
       <w:tblStyleColBandSize w:val="1"/>
       <w:tblCellMar>
-        <w:top w:w="0" w:type="dxa"/>
         <w:left w:w="108" w:type="dxa"/>
-        <w:bottom w:w="0" w:type="dxa"/>
         <w:right w:w="108" w:type="dxa"/>
       </w:tblCellMar>
     </w:tblPr>
@@ -14427,9 +14305,7 @@
       <w:tblStyleRowBandSize w:val="1"/>
       <w:tblStyleColBandSize w:val="1"/>
       <w:tblCellMar>
-        <w:top w:w="0" w:type="dxa"/>
         <w:left w:w="108" w:type="dxa"/>
-        <w:bottom w:w="0" w:type="dxa"/>
         <w:right w:w="108" w:type="dxa"/>
       </w:tblCellMar>
     </w:tblPr>
@@ -14443,9 +14319,7 @@
       <w:tblStyleRowBandSize w:val="1"/>
       <w:tblStyleColBandSize w:val="1"/>
       <w:tblCellMar>
-        <w:top w:w="0" w:type="dxa"/>
         <w:left w:w="108" w:type="dxa"/>
-        <w:bottom w:w="0" w:type="dxa"/>
         <w:right w:w="108" w:type="dxa"/>
       </w:tblCellMar>
     </w:tblPr>
@@ -14459,9 +14333,7 @@
       <w:tblStyleRowBandSize w:val="1"/>
       <w:tblStyleColBandSize w:val="1"/>
       <w:tblCellMar>
-        <w:top w:w="0" w:type="dxa"/>
         <w:left w:w="108" w:type="dxa"/>
-        <w:bottom w:w="0" w:type="dxa"/>
         <w:right w:w="108" w:type="dxa"/>
       </w:tblCellMar>
     </w:tblPr>
@@ -14475,9 +14347,7 @@
       <w:tblStyleRowBandSize w:val="1"/>
       <w:tblStyleColBandSize w:val="1"/>
       <w:tblCellMar>
-        <w:top w:w="0" w:type="dxa"/>
         <w:left w:w="108" w:type="dxa"/>
-        <w:bottom w:w="0" w:type="dxa"/>
         <w:right w:w="108" w:type="dxa"/>
       </w:tblCellMar>
     </w:tblPr>
@@ -14491,9 +14361,7 @@
       <w:tblStyleRowBandSize w:val="1"/>
       <w:tblStyleColBandSize w:val="1"/>
       <w:tblCellMar>
-        <w:top w:w="0" w:type="dxa"/>
         <w:left w:w="108" w:type="dxa"/>
-        <w:bottom w:w="0" w:type="dxa"/>
         <w:right w:w="108" w:type="dxa"/>
       </w:tblCellMar>
     </w:tblPr>
@@ -14507,9 +14375,7 @@
       <w:tblStyleRowBandSize w:val="1"/>
       <w:tblStyleColBandSize w:val="1"/>
       <w:tblCellMar>
-        <w:top w:w="0" w:type="dxa"/>
         <w:left w:w="108" w:type="dxa"/>
-        <w:bottom w:w="0" w:type="dxa"/>
         <w:right w:w="108" w:type="dxa"/>
       </w:tblCellMar>
     </w:tblPr>
@@ -14523,9 +14389,7 @@
       <w:tblStyleRowBandSize w:val="1"/>
       <w:tblStyleColBandSize w:val="1"/>
       <w:tblCellMar>
-        <w:top w:w="0" w:type="dxa"/>
         <w:left w:w="108" w:type="dxa"/>
-        <w:bottom w:w="0" w:type="dxa"/>
         <w:right w:w="108" w:type="dxa"/>
       </w:tblCellMar>
     </w:tblPr>
@@ -14539,9 +14403,7 @@
       <w:tblStyleRowBandSize w:val="1"/>
       <w:tblStyleColBandSize w:val="1"/>
       <w:tblCellMar>
-        <w:top w:w="0" w:type="dxa"/>
         <w:left w:w="108" w:type="dxa"/>
-        <w:bottom w:w="0" w:type="dxa"/>
         <w:right w:w="108" w:type="dxa"/>
       </w:tblCellMar>
     </w:tblPr>
@@ -14555,9 +14417,7 @@
       <w:tblStyleRowBandSize w:val="1"/>
       <w:tblStyleColBandSize w:val="1"/>
       <w:tblCellMar>
-        <w:top w:w="0" w:type="dxa"/>
         <w:left w:w="108" w:type="dxa"/>
-        <w:bottom w:w="0" w:type="dxa"/>
         <w:right w:w="108" w:type="dxa"/>
       </w:tblCellMar>
     </w:tblPr>
@@ -14571,9 +14431,7 @@
       <w:tblStyleRowBandSize w:val="1"/>
       <w:tblStyleColBandSize w:val="1"/>
       <w:tblCellMar>
-        <w:top w:w="0" w:type="dxa"/>
         <w:left w:w="108" w:type="dxa"/>
-        <w:bottom w:w="0" w:type="dxa"/>
         <w:right w:w="108" w:type="dxa"/>
       </w:tblCellMar>
     </w:tblPr>
@@ -14587,9 +14445,7 @@
       <w:tblStyleRowBandSize w:val="1"/>
       <w:tblStyleColBandSize w:val="1"/>
       <w:tblCellMar>
-        <w:top w:w="0" w:type="dxa"/>
         <w:left w:w="108" w:type="dxa"/>
-        <w:bottom w:w="0" w:type="dxa"/>
         <w:right w:w="108" w:type="dxa"/>
       </w:tblCellMar>
     </w:tblPr>
@@ -14599,12 +14455,6 @@
     <w:tblPr>
       <w:tblStyleRowBandSize w:val="1"/>
       <w:tblStyleColBandSize w:val="1"/>
-      <w:tblCellMar>
-        <w:top w:w="0" w:type="dxa"/>
-        <w:left w:w="0" w:type="dxa"/>
-        <w:bottom w:w="0" w:type="dxa"/>
-        <w:right w:w="0" w:type="dxa"/>
-      </w:tblCellMar>
     </w:tblPr>
   </w:style>
   <w:style w:type="table" w:customStyle="1" w:styleId="af0">
@@ -14612,12 +14462,6 @@
     <w:tblPr>
       <w:tblStyleRowBandSize w:val="1"/>
       <w:tblStyleColBandSize w:val="1"/>
-      <w:tblCellMar>
-        <w:top w:w="0" w:type="dxa"/>
-        <w:left w:w="0" w:type="dxa"/>
-        <w:bottom w:w="0" w:type="dxa"/>
-        <w:right w:w="0" w:type="dxa"/>
-      </w:tblCellMar>
     </w:tblPr>
   </w:style>
   <w:style w:type="table" w:customStyle="1" w:styleId="af1">
@@ -14625,12 +14469,6 @@
     <w:tblPr>
       <w:tblStyleRowBandSize w:val="1"/>
       <w:tblStyleColBandSize w:val="1"/>
-      <w:tblCellMar>
-        <w:top w:w="0" w:type="dxa"/>
-        <w:left w:w="0" w:type="dxa"/>
-        <w:bottom w:w="0" w:type="dxa"/>
-        <w:right w:w="0" w:type="dxa"/>
-      </w:tblCellMar>
     </w:tblPr>
   </w:style>
   <w:style w:type="table" w:customStyle="1" w:styleId="af2">
@@ -14638,12 +14476,6 @@
     <w:tblPr>
       <w:tblStyleRowBandSize w:val="1"/>
       <w:tblStyleColBandSize w:val="1"/>
-      <w:tblCellMar>
-        <w:top w:w="0" w:type="dxa"/>
-        <w:left w:w="0" w:type="dxa"/>
-        <w:bottom w:w="0" w:type="dxa"/>
-        <w:right w:w="0" w:type="dxa"/>
-      </w:tblCellMar>
     </w:tblPr>
   </w:style>
   <w:style w:type="table" w:customStyle="1" w:styleId="af3">
@@ -14651,12 +14483,6 @@
     <w:tblPr>
       <w:tblStyleRowBandSize w:val="1"/>
       <w:tblStyleColBandSize w:val="1"/>
-      <w:tblCellMar>
-        <w:top w:w="0" w:type="dxa"/>
-        <w:left w:w="0" w:type="dxa"/>
-        <w:bottom w:w="0" w:type="dxa"/>
-        <w:right w:w="0" w:type="dxa"/>
-      </w:tblCellMar>
     </w:tblPr>
   </w:style>
   <w:style w:type="table" w:customStyle="1" w:styleId="af4">
@@ -14664,12 +14490,6 @@
     <w:tblPr>
       <w:tblStyleRowBandSize w:val="1"/>
       <w:tblStyleColBandSize w:val="1"/>
-      <w:tblCellMar>
-        <w:top w:w="0" w:type="dxa"/>
-        <w:left w:w="0" w:type="dxa"/>
-        <w:bottom w:w="0" w:type="dxa"/>
-        <w:right w:w="0" w:type="dxa"/>
-      </w:tblCellMar>
     </w:tblPr>
   </w:style>
   <w:style w:type="table" w:customStyle="1" w:styleId="af5">
@@ -14677,12 +14497,6 @@
     <w:tblPr>
       <w:tblStyleRowBandSize w:val="1"/>
       <w:tblStyleColBandSize w:val="1"/>
-      <w:tblCellMar>
-        <w:top w:w="0" w:type="dxa"/>
-        <w:left w:w="0" w:type="dxa"/>
-        <w:bottom w:w="0" w:type="dxa"/>
-        <w:right w:w="0" w:type="dxa"/>
-      </w:tblCellMar>
     </w:tblPr>
   </w:style>
   <w:style w:type="table" w:customStyle="1" w:styleId="af6">
@@ -14690,12 +14504,6 @@
     <w:tblPr>
       <w:tblStyleRowBandSize w:val="1"/>
       <w:tblStyleColBandSize w:val="1"/>
-      <w:tblCellMar>
-        <w:top w:w="0" w:type="dxa"/>
-        <w:left w:w="0" w:type="dxa"/>
-        <w:bottom w:w="0" w:type="dxa"/>
-        <w:right w:w="0" w:type="dxa"/>
-      </w:tblCellMar>
     </w:tblPr>
   </w:style>
   <w:style w:type="table" w:customStyle="1" w:styleId="af7">
@@ -14707,9 +14515,7 @@
       <w:tblStyleRowBandSize w:val="1"/>
       <w:tblStyleColBandSize w:val="1"/>
       <w:tblCellMar>
-        <w:top w:w="0" w:type="dxa"/>
         <w:left w:w="108" w:type="dxa"/>
-        <w:bottom w:w="0" w:type="dxa"/>
         <w:right w:w="108" w:type="dxa"/>
       </w:tblCellMar>
     </w:tblPr>
@@ -14723,9 +14529,7 @@
       <w:tblStyleRowBandSize w:val="1"/>
       <w:tblStyleColBandSize w:val="1"/>
       <w:tblCellMar>
-        <w:top w:w="0" w:type="dxa"/>
         <w:left w:w="108" w:type="dxa"/>
-        <w:bottom w:w="0" w:type="dxa"/>
         <w:right w:w="108" w:type="dxa"/>
       </w:tblCellMar>
     </w:tblPr>
@@ -14739,9 +14543,7 @@
       <w:tblStyleRowBandSize w:val="1"/>
       <w:tblStyleColBandSize w:val="1"/>
       <w:tblCellMar>
-        <w:top w:w="0" w:type="dxa"/>
         <w:left w:w="108" w:type="dxa"/>
-        <w:bottom w:w="0" w:type="dxa"/>
         <w:right w:w="108" w:type="dxa"/>
       </w:tblCellMar>
     </w:tblPr>
@@ -14755,9 +14557,7 @@
       <w:tblStyleRowBandSize w:val="1"/>
       <w:tblStyleColBandSize w:val="1"/>
       <w:tblCellMar>
-        <w:top w:w="0" w:type="dxa"/>
         <w:left w:w="108" w:type="dxa"/>
-        <w:bottom w:w="0" w:type="dxa"/>
         <w:right w:w="108" w:type="dxa"/>
       </w:tblCellMar>
     </w:tblPr>
@@ -14771,9 +14571,7 @@
       <w:tblStyleRowBandSize w:val="1"/>
       <w:tblStyleColBandSize w:val="1"/>
       <w:tblCellMar>
-        <w:top w:w="0" w:type="dxa"/>
         <w:left w:w="108" w:type="dxa"/>
-        <w:bottom w:w="0" w:type="dxa"/>
         <w:right w:w="108" w:type="dxa"/>
       </w:tblCellMar>
     </w:tblPr>
@@ -14787,9 +14585,7 @@
       <w:tblStyleRowBandSize w:val="1"/>
       <w:tblStyleColBandSize w:val="1"/>
       <w:tblCellMar>
-        <w:top w:w="0" w:type="dxa"/>
         <w:left w:w="108" w:type="dxa"/>
-        <w:bottom w:w="0" w:type="dxa"/>
         <w:right w:w="108" w:type="dxa"/>
       </w:tblCellMar>
     </w:tblPr>
@@ -14803,9 +14599,7 @@
       <w:tblStyleRowBandSize w:val="1"/>
       <w:tblStyleColBandSize w:val="1"/>
       <w:tblCellMar>
-        <w:top w:w="0" w:type="dxa"/>
         <w:left w:w="108" w:type="dxa"/>
-        <w:bottom w:w="0" w:type="dxa"/>
         <w:right w:w="108" w:type="dxa"/>
       </w:tblCellMar>
     </w:tblPr>

</xml_diff>